<commit_message>
Add final paper PDF, add author Hyeongjin Park (SIM/SW)
- docs/: add final paper PDF; add note on the 351MB presentation PPTX
  excluded from the repo (exceeds GitHub 100MB limit)
- .gitignore: track docs/*.pdf (override global *.pdf ignore)
- manuscripts (manuscript_autorobot.docx, 논문_food_waste_robot.docx) and
  tools/build_manuscript.py: add 박형진 / Hyeongjin Park to author byline
  (SIM·SW: digital-twin environment, AI algorithm); existing authors kept
- README: add Contributors section incl. 박형진 (SIM·SW)
</commit_message>
<xml_diff>
--- a/manuscript_autorobot.docx
+++ b/manuscript_autorobot.docx
@@ -58,7 +58,7 @@
         <w:rPr>
           <w:rFonts w:ascii="돋움체" w:hAnsi="돋움체"/>
         </w:rPr>
-        <w:t>이경석 · 이상윤 · 전민제</w:t>
+        <w:t>이경석 · 이상윤 · 전민제 · 박형진</w:t>
       </w:r>
     </w:p>
     <w:p>
@@ -154,7 +154,7 @@
           <w:sz w:val="24"/>
           <w:szCs w:val="24"/>
         </w:rPr>
-        <w:t xml:space="preserve"> Lee and Minje Jeon</w:t>
+        <w:t xml:space="preserve"> Lee, Minje Jeon and Hyeongjin Park</w:t>
       </w:r>
     </w:p>
     <w:p>

</xml_diff>